<commit_message>
chore: commit current gxp audit baseline
</commit_message>
<xml_diff>
--- a/docs/csv-validation/CSV-INT-20260908-7.1-7.4现场记录表单册.docx
+++ b/docs/csv-validation/CSV-INT-20260908-7.1-7.4现场记录表单册.docx
@@ -55,7 +55,7 @@
           <w:i w:val="false"/>
           <w:sz w:val="21"/>
         </w:rPr>
-        <w:t xml:space="preserve">文件编号：CSV-INT-20260908-FORMS　版本：V0.2　生成日期：2026年09月09日</w:t>
+        <w:t xml:space="preserve">文件编号 CSV-INT-20260908-FORMS　版本 V0.2　生成日期 2026年09月09日</w:t>
       </w:r>
     </w:p>
     <w:p>
@@ -4461,1371 +4461,26 @@
           </w:p>
         </w:tc>
       </w:tr>
-      <w:tr>
-        <w:trPr>
-          <w:cantSplit/>
-        </w:trPr>
-        <w:tc>
-          <w:tcPr>
-            <w:tcBorders>
-              <w:top w:val="single" w:color="B7C9D6" w:sz="4"/>
-              <w:left w:val="single" w:color="B7C9D6" w:sz="4"/>
-              <w:bottom w:val="single" w:color="B7C9D6" w:sz="4"/>
-              <w:right w:val="single" w:color="B7C9D6" w:sz="4"/>
-            </w:tcBorders>
-            <w:shd w:val="clear" w:fill="FFFFFF"/>
-            <w:tcMar>
-              <w:top w:w="70" w:type="dxa"/>
-              <w:left w:w="80" w:type="dxa"/>
-              <w:bottom w:w="70" w:type="dxa"/>
-              <w:right w:w="80" w:type="dxa"/>
-            </w:tcMar>
-            <w:vAlign w:val="center"/>
-          </w:tcPr>
-          <w:p>
-            <w:r>
-              <w:rPr>
-                <w:rFonts w:ascii="Microsoft YaHei" w:hAnsi="Microsoft YaHei" w:eastAsia="Microsoft YaHei"/>
-                <w:b w:val="false"/>
-                <w:sz w:val="16"/>
-              </w:rPr>
-              <w:t xml:space="preserve">7</w:t>
-            </w:r>
-          </w:p>
-        </w:tc>
-        <w:tc>
-          <w:tcPr>
-            <w:tcBorders>
-              <w:top w:val="single" w:color="B7C9D6" w:sz="4"/>
-              <w:left w:val="single" w:color="B7C9D6" w:sz="4"/>
-              <w:bottom w:val="single" w:color="B7C9D6" w:sz="4"/>
-              <w:right w:val="single" w:color="B7C9D6" w:sz="4"/>
-            </w:tcBorders>
-            <w:shd w:val="clear" w:fill="FFFFFF"/>
-            <w:tcMar>
-              <w:top w:w="70" w:type="dxa"/>
-              <w:left w:w="80" w:type="dxa"/>
-              <w:bottom w:w="70" w:type="dxa"/>
-              <w:right w:w="80" w:type="dxa"/>
-            </w:tcMar>
-            <w:vAlign w:val="center"/>
-          </w:tcPr>
-          <w:p>
-            <w:r>
-              <w:rPr>
-                <w:rFonts w:ascii="Microsoft YaHei" w:hAnsi="Microsoft YaHei" w:eastAsia="Microsoft YaHei"/>
-                <w:b w:val="false"/>
-                <w:sz w:val="16"/>
-              </w:rPr>
-              <w:t xml:space="preserve">现场填写</w:t>
-            </w:r>
-          </w:p>
-        </w:tc>
-        <w:tc>
-          <w:tcPr>
-            <w:tcBorders>
-              <w:top w:val="single" w:color="B7C9D6" w:sz="4"/>
-              <w:left w:val="single" w:color="B7C9D6" w:sz="4"/>
-              <w:bottom w:val="single" w:color="B7C9D6" w:sz="4"/>
-              <w:right w:val="single" w:color="B7C9D6" w:sz="4"/>
-            </w:tcBorders>
-            <w:shd w:val="clear" w:fill="FFFFFF"/>
-            <w:tcMar>
-              <w:top w:w="70" w:type="dxa"/>
-              <w:left w:w="80" w:type="dxa"/>
-              <w:bottom w:w="70" w:type="dxa"/>
-              <w:right w:w="80" w:type="dxa"/>
-            </w:tcMar>
-            <w:vAlign w:val="center"/>
-          </w:tcPr>
-          <w:p>
-            <w:r>
-              <w:rPr>
-                <w:rFonts w:ascii="Microsoft YaHei" w:hAnsi="Microsoft YaHei" w:eastAsia="Microsoft YaHei"/>
-                <w:b w:val="false"/>
-                <w:sz w:val="16"/>
-              </w:rPr>
-              <w:t xml:space="preserve">现场填写</w:t>
-            </w:r>
-          </w:p>
-        </w:tc>
-        <w:tc>
-          <w:tcPr>
-            <w:tcBorders>
-              <w:top w:val="single" w:color="B7C9D6" w:sz="4"/>
-              <w:left w:val="single" w:color="B7C9D6" w:sz="4"/>
-              <w:bottom w:val="single" w:color="B7C9D6" w:sz="4"/>
-              <w:right w:val="single" w:color="B7C9D6" w:sz="4"/>
-            </w:tcBorders>
-            <w:shd w:val="clear" w:fill="FFFFFF"/>
-            <w:tcMar>
-              <w:top w:w="70" w:type="dxa"/>
-              <w:left w:w="80" w:type="dxa"/>
-              <w:bottom w:w="70" w:type="dxa"/>
-              <w:right w:w="80" w:type="dxa"/>
-            </w:tcMar>
-            <w:vAlign w:val="center"/>
-          </w:tcPr>
-          <w:p>
-            <w:r>
-              <w:rPr>
-                <w:rFonts w:ascii="Microsoft YaHei" w:hAnsi="Microsoft YaHei" w:eastAsia="Microsoft YaHei"/>
-                <w:b w:val="false"/>
-                <w:sz w:val="16"/>
-              </w:rPr>
-              <w:t xml:space="preserve">现场填写</w:t>
-            </w:r>
-          </w:p>
-        </w:tc>
-        <w:tc>
-          <w:tcPr>
-            <w:tcBorders>
-              <w:top w:val="single" w:color="B7C9D6" w:sz="4"/>
-              <w:left w:val="single" w:color="B7C9D6" w:sz="4"/>
-              <w:bottom w:val="single" w:color="B7C9D6" w:sz="4"/>
-              <w:right w:val="single" w:color="B7C9D6" w:sz="4"/>
-            </w:tcBorders>
-            <w:shd w:val="clear" w:fill="FFFFFF"/>
-            <w:tcMar>
-              <w:top w:w="70" w:type="dxa"/>
-              <w:left w:w="80" w:type="dxa"/>
-              <w:bottom w:w="70" w:type="dxa"/>
-              <w:right w:w="80" w:type="dxa"/>
-            </w:tcMar>
-            <w:vAlign w:val="center"/>
-          </w:tcPr>
-          <w:p>
-            <w:r>
-              <w:rPr>
-                <w:rFonts w:ascii="Microsoft YaHei" w:hAnsi="Microsoft YaHei" w:eastAsia="Microsoft YaHei"/>
-                <w:b w:val="false"/>
-                <w:sz w:val="16"/>
-              </w:rPr>
-              <w:t xml:space="preserve">现场填写</w:t>
-            </w:r>
-          </w:p>
-        </w:tc>
-        <w:tc>
-          <w:tcPr>
-            <w:tcBorders>
-              <w:top w:val="single" w:color="B7C9D6" w:sz="4"/>
-              <w:left w:val="single" w:color="B7C9D6" w:sz="4"/>
-              <w:bottom w:val="single" w:color="B7C9D6" w:sz="4"/>
-              <w:right w:val="single" w:color="B7C9D6" w:sz="4"/>
-            </w:tcBorders>
-            <w:shd w:val="clear" w:fill="FFFFFF"/>
-            <w:tcMar>
-              <w:top w:w="70" w:type="dxa"/>
-              <w:left w:w="80" w:type="dxa"/>
-              <w:bottom w:w="70" w:type="dxa"/>
-              <w:right w:w="80" w:type="dxa"/>
-            </w:tcMar>
-            <w:vAlign w:val="center"/>
-          </w:tcPr>
-          <w:p>
-            <w:r>
-              <w:rPr>
-                <w:rFonts w:ascii="Microsoft YaHei" w:hAnsi="Microsoft YaHei" w:eastAsia="Microsoft YaHei"/>
-                <w:b w:val="false"/>
-                <w:sz w:val="16"/>
-              </w:rPr>
-              <w:t xml:space="preserve">____________</w:t>
-            </w:r>
-          </w:p>
-        </w:tc>
-        <w:tc>
-          <w:tcPr>
-            <w:tcBorders>
-              <w:top w:val="single" w:color="B7C9D6" w:sz="4"/>
-              <w:left w:val="single" w:color="B7C9D6" w:sz="4"/>
-              <w:bottom w:val="single" w:color="B7C9D6" w:sz="4"/>
-              <w:right w:val="single" w:color="B7C9D6" w:sz="4"/>
-            </w:tcBorders>
-            <w:shd w:val="clear" w:fill="FFFFFF"/>
-            <w:tcMar>
-              <w:top w:w="70" w:type="dxa"/>
-              <w:left w:w="80" w:type="dxa"/>
-              <w:bottom w:w="70" w:type="dxa"/>
-              <w:right w:w="80" w:type="dxa"/>
-            </w:tcMar>
-            <w:vAlign w:val="center"/>
-          </w:tcPr>
-          <w:p>
-            <w:r>
-              <w:rPr>
-                <w:rFonts w:ascii="Microsoft YaHei" w:hAnsi="Microsoft YaHei" w:eastAsia="Microsoft YaHei"/>
-                <w:b w:val="false"/>
-                <w:sz w:val="16"/>
-              </w:rPr>
-              <w:t xml:space="preserve">______</w:t>
-            </w:r>
-          </w:p>
-        </w:tc>
-        <w:tc>
-          <w:tcPr>
-            <w:tcBorders>
-              <w:top w:val="single" w:color="B7C9D6" w:sz="4"/>
-              <w:left w:val="single" w:color="B7C9D6" w:sz="4"/>
-              <w:bottom w:val="single" w:color="B7C9D6" w:sz="4"/>
-              <w:right w:val="single" w:color="B7C9D6" w:sz="4"/>
-            </w:tcBorders>
-            <w:shd w:val="clear" w:fill="FFFFFF"/>
-            <w:tcMar>
-              <w:top w:w="70" w:type="dxa"/>
-              <w:left w:w="80" w:type="dxa"/>
-              <w:bottom w:w="70" w:type="dxa"/>
-              <w:right w:w="80" w:type="dxa"/>
-            </w:tcMar>
-            <w:vAlign w:val="center"/>
-          </w:tcPr>
-          <w:p>
-            <w:r>
-              <w:rPr>
-                <w:rFonts w:ascii="Microsoft YaHei" w:hAnsi="Microsoft YaHei" w:eastAsia="Microsoft YaHei"/>
-                <w:b w:val="false"/>
-                <w:sz w:val="16"/>
-              </w:rPr>
-              <w:t xml:space="preserve">____________</w:t>
-            </w:r>
-          </w:p>
-        </w:tc>
-        <w:tc>
-          <w:tcPr>
-            <w:tcBorders>
-              <w:top w:val="single" w:color="B7C9D6" w:sz="4"/>
-              <w:left w:val="single" w:color="B7C9D6" w:sz="4"/>
-              <w:bottom w:val="single" w:color="B7C9D6" w:sz="4"/>
-              <w:right w:val="single" w:color="B7C9D6" w:sz="4"/>
-            </w:tcBorders>
-            <w:shd w:val="clear" w:fill="FFFFFF"/>
-            <w:tcMar>
-              <w:top w:w="70" w:type="dxa"/>
-              <w:left w:w="80" w:type="dxa"/>
-              <w:bottom w:w="70" w:type="dxa"/>
-              <w:right w:w="80" w:type="dxa"/>
-            </w:tcMar>
-            <w:vAlign w:val="center"/>
-          </w:tcPr>
-          <w:p>
-            <w:r>
-              <w:rPr>
-                <w:rFonts w:ascii="Microsoft YaHei" w:hAnsi="Microsoft YaHei" w:eastAsia="Microsoft YaHei"/>
-                <w:b w:val="false"/>
-                <w:sz w:val="16"/>
-              </w:rPr>
-              <w:t xml:space="preserve">□合格 □不合格</w:t>
-            </w:r>
-          </w:p>
-        </w:tc>
-        <w:tc>
-          <w:tcPr>
-            <w:tcBorders>
-              <w:top w:val="single" w:color="B7C9D6" w:sz="4"/>
-              <w:left w:val="single" w:color="B7C9D6" w:sz="4"/>
-              <w:bottom w:val="single" w:color="B7C9D6" w:sz="4"/>
-              <w:right w:val="single" w:color="B7C9D6" w:sz="4"/>
-            </w:tcBorders>
-            <w:shd w:val="clear" w:fill="FFFFFF"/>
-            <w:tcMar>
-              <w:top w:w="70" w:type="dxa"/>
-              <w:left w:w="80" w:type="dxa"/>
-              <w:bottom w:w="70" w:type="dxa"/>
-              <w:right w:w="80" w:type="dxa"/>
-            </w:tcMar>
-            <w:vAlign w:val="center"/>
-          </w:tcPr>
-          <w:p>
-            <w:r>
-              <w:rPr>
-                <w:rFonts w:ascii="Microsoft YaHei" w:hAnsi="Microsoft YaHei" w:eastAsia="Microsoft YaHei"/>
-                <w:b w:val="false"/>
-                <w:sz w:val="16"/>
-              </w:rPr>
-              <w:t xml:space="preserve">____________</w:t>
-            </w:r>
-          </w:p>
-        </w:tc>
-        <w:tc>
-          <w:tcPr>
-            <w:tcBorders>
-              <w:top w:val="single" w:color="B7C9D6" w:sz="4"/>
-              <w:left w:val="single" w:color="B7C9D6" w:sz="4"/>
-              <w:bottom w:val="single" w:color="B7C9D6" w:sz="4"/>
-              <w:right w:val="single" w:color="B7C9D6" w:sz="4"/>
-            </w:tcBorders>
-            <w:shd w:val="clear" w:fill="FFFFFF"/>
-            <w:tcMar>
-              <w:top w:w="70" w:type="dxa"/>
-              <w:left w:w="80" w:type="dxa"/>
-              <w:bottom w:w="70" w:type="dxa"/>
-              <w:right w:w="80" w:type="dxa"/>
-            </w:tcMar>
-            <w:vAlign w:val="center"/>
-          </w:tcPr>
-          <w:p>
-            <w:r>
-              <w:rPr>
-                <w:rFonts w:ascii="Microsoft YaHei" w:hAnsi="Microsoft YaHei" w:eastAsia="Microsoft YaHei"/>
-                <w:b w:val="false"/>
-                <w:sz w:val="16"/>
-              </w:rPr>
-              <w:t xml:space="preserve">____________</w:t>
-            </w:r>
-          </w:p>
-        </w:tc>
-        <w:tc>
-          <w:tcPr>
-            <w:tcBorders>
-              <w:top w:val="single" w:color="B7C9D6" w:sz="4"/>
-              <w:left w:val="single" w:color="B7C9D6" w:sz="4"/>
-              <w:bottom w:val="single" w:color="B7C9D6" w:sz="4"/>
-              <w:right w:val="single" w:color="B7C9D6" w:sz="4"/>
-            </w:tcBorders>
-            <w:shd w:val="clear" w:fill="FFFFFF"/>
-            <w:tcMar>
-              <w:top w:w="70" w:type="dxa"/>
-              <w:left w:w="80" w:type="dxa"/>
-              <w:bottom w:w="70" w:type="dxa"/>
-              <w:right w:w="80" w:type="dxa"/>
-            </w:tcMar>
-            <w:vAlign w:val="center"/>
-          </w:tcPr>
-          <w:p>
-            <w:r>
-              <w:rPr>
-                <w:rFonts w:ascii="Microsoft YaHei" w:hAnsi="Microsoft YaHei" w:eastAsia="Microsoft YaHei"/>
-                <w:b w:val="false"/>
-                <w:sz w:val="16"/>
-              </w:rPr>
-              <w:t xml:space="preserve">____________</w:t>
-            </w:r>
-          </w:p>
-        </w:tc>
-      </w:tr>
-      <w:tr>
-        <w:trPr>
-          <w:cantSplit/>
-        </w:trPr>
-        <w:tc>
-          <w:tcPr>
-            <w:tcBorders>
-              <w:top w:val="single" w:color="B7C9D6" w:sz="4"/>
-              <w:left w:val="single" w:color="B7C9D6" w:sz="4"/>
-              <w:bottom w:val="single" w:color="B7C9D6" w:sz="4"/>
-              <w:right w:val="single" w:color="B7C9D6" w:sz="4"/>
-            </w:tcBorders>
-            <w:shd w:val="clear" w:fill="F7FBFF"/>
-            <w:tcMar>
-              <w:top w:w="70" w:type="dxa"/>
-              <w:left w:w="80" w:type="dxa"/>
-              <w:bottom w:w="70" w:type="dxa"/>
-              <w:right w:w="80" w:type="dxa"/>
-            </w:tcMar>
-            <w:vAlign w:val="center"/>
-          </w:tcPr>
-          <w:p>
-            <w:r>
-              <w:rPr>
-                <w:rFonts w:ascii="Microsoft YaHei" w:hAnsi="Microsoft YaHei" w:eastAsia="Microsoft YaHei"/>
-                <w:b w:val="false"/>
-                <w:sz w:val="16"/>
-              </w:rPr>
-              <w:t xml:space="preserve">8</w:t>
-            </w:r>
-          </w:p>
-        </w:tc>
-        <w:tc>
-          <w:tcPr>
-            <w:tcBorders>
-              <w:top w:val="single" w:color="B7C9D6" w:sz="4"/>
-              <w:left w:val="single" w:color="B7C9D6" w:sz="4"/>
-              <w:bottom w:val="single" w:color="B7C9D6" w:sz="4"/>
-              <w:right w:val="single" w:color="B7C9D6" w:sz="4"/>
-            </w:tcBorders>
-            <w:shd w:val="clear" w:fill="F7FBFF"/>
-            <w:tcMar>
-              <w:top w:w="70" w:type="dxa"/>
-              <w:left w:w="80" w:type="dxa"/>
-              <w:bottom w:w="70" w:type="dxa"/>
-              <w:right w:w="80" w:type="dxa"/>
-            </w:tcMar>
-            <w:vAlign w:val="center"/>
-          </w:tcPr>
-          <w:p>
-            <w:r>
-              <w:rPr>
-                <w:rFonts w:ascii="Microsoft YaHei" w:hAnsi="Microsoft YaHei" w:eastAsia="Microsoft YaHei"/>
-                <w:b w:val="false"/>
-                <w:sz w:val="16"/>
-              </w:rPr>
-              <w:t xml:space="preserve">现场填写</w:t>
-            </w:r>
-          </w:p>
-        </w:tc>
-        <w:tc>
-          <w:tcPr>
-            <w:tcBorders>
-              <w:top w:val="single" w:color="B7C9D6" w:sz="4"/>
-              <w:left w:val="single" w:color="B7C9D6" w:sz="4"/>
-              <w:bottom w:val="single" w:color="B7C9D6" w:sz="4"/>
-              <w:right w:val="single" w:color="B7C9D6" w:sz="4"/>
-            </w:tcBorders>
-            <w:shd w:val="clear" w:fill="F7FBFF"/>
-            <w:tcMar>
-              <w:top w:w="70" w:type="dxa"/>
-              <w:left w:w="80" w:type="dxa"/>
-              <w:bottom w:w="70" w:type="dxa"/>
-              <w:right w:w="80" w:type="dxa"/>
-            </w:tcMar>
-            <w:vAlign w:val="center"/>
-          </w:tcPr>
-          <w:p>
-            <w:r>
-              <w:rPr>
-                <w:rFonts w:ascii="Microsoft YaHei" w:hAnsi="Microsoft YaHei" w:eastAsia="Microsoft YaHei"/>
-                <w:b w:val="false"/>
-                <w:sz w:val="16"/>
-              </w:rPr>
-              <w:t xml:space="preserve">现场填写</w:t>
-            </w:r>
-          </w:p>
-        </w:tc>
-        <w:tc>
-          <w:tcPr>
-            <w:tcBorders>
-              <w:top w:val="single" w:color="B7C9D6" w:sz="4"/>
-              <w:left w:val="single" w:color="B7C9D6" w:sz="4"/>
-              <w:bottom w:val="single" w:color="B7C9D6" w:sz="4"/>
-              <w:right w:val="single" w:color="B7C9D6" w:sz="4"/>
-            </w:tcBorders>
-            <w:shd w:val="clear" w:fill="F7FBFF"/>
-            <w:tcMar>
-              <w:top w:w="70" w:type="dxa"/>
-              <w:left w:w="80" w:type="dxa"/>
-              <w:bottom w:w="70" w:type="dxa"/>
-              <w:right w:w="80" w:type="dxa"/>
-            </w:tcMar>
-            <w:vAlign w:val="center"/>
-          </w:tcPr>
-          <w:p>
-            <w:r>
-              <w:rPr>
-                <w:rFonts w:ascii="Microsoft YaHei" w:hAnsi="Microsoft YaHei" w:eastAsia="Microsoft YaHei"/>
-                <w:b w:val="false"/>
-                <w:sz w:val="16"/>
-              </w:rPr>
-              <w:t xml:space="preserve">现场填写</w:t>
-            </w:r>
-          </w:p>
-        </w:tc>
-        <w:tc>
-          <w:tcPr>
-            <w:tcBorders>
-              <w:top w:val="single" w:color="B7C9D6" w:sz="4"/>
-              <w:left w:val="single" w:color="B7C9D6" w:sz="4"/>
-              <w:bottom w:val="single" w:color="B7C9D6" w:sz="4"/>
-              <w:right w:val="single" w:color="B7C9D6" w:sz="4"/>
-            </w:tcBorders>
-            <w:shd w:val="clear" w:fill="F7FBFF"/>
-            <w:tcMar>
-              <w:top w:w="70" w:type="dxa"/>
-              <w:left w:w="80" w:type="dxa"/>
-              <w:bottom w:w="70" w:type="dxa"/>
-              <w:right w:w="80" w:type="dxa"/>
-            </w:tcMar>
-            <w:vAlign w:val="center"/>
-          </w:tcPr>
-          <w:p>
-            <w:r>
-              <w:rPr>
-                <w:rFonts w:ascii="Microsoft YaHei" w:hAnsi="Microsoft YaHei" w:eastAsia="Microsoft YaHei"/>
-                <w:b w:val="false"/>
-                <w:sz w:val="16"/>
-              </w:rPr>
-              <w:t xml:space="preserve">现场填写</w:t>
-            </w:r>
-          </w:p>
-        </w:tc>
-        <w:tc>
-          <w:tcPr>
-            <w:tcBorders>
-              <w:top w:val="single" w:color="B7C9D6" w:sz="4"/>
-              <w:left w:val="single" w:color="B7C9D6" w:sz="4"/>
-              <w:bottom w:val="single" w:color="B7C9D6" w:sz="4"/>
-              <w:right w:val="single" w:color="B7C9D6" w:sz="4"/>
-            </w:tcBorders>
-            <w:shd w:val="clear" w:fill="F7FBFF"/>
-            <w:tcMar>
-              <w:top w:w="70" w:type="dxa"/>
-              <w:left w:w="80" w:type="dxa"/>
-              <w:bottom w:w="70" w:type="dxa"/>
-              <w:right w:w="80" w:type="dxa"/>
-            </w:tcMar>
-            <w:vAlign w:val="center"/>
-          </w:tcPr>
-          <w:p>
-            <w:r>
-              <w:rPr>
-                <w:rFonts w:ascii="Microsoft YaHei" w:hAnsi="Microsoft YaHei" w:eastAsia="Microsoft YaHei"/>
-                <w:b w:val="false"/>
-                <w:sz w:val="16"/>
-              </w:rPr>
-              <w:t xml:space="preserve">____________</w:t>
-            </w:r>
-          </w:p>
-        </w:tc>
-        <w:tc>
-          <w:tcPr>
-            <w:tcBorders>
-              <w:top w:val="single" w:color="B7C9D6" w:sz="4"/>
-              <w:left w:val="single" w:color="B7C9D6" w:sz="4"/>
-              <w:bottom w:val="single" w:color="B7C9D6" w:sz="4"/>
-              <w:right w:val="single" w:color="B7C9D6" w:sz="4"/>
-            </w:tcBorders>
-            <w:shd w:val="clear" w:fill="F7FBFF"/>
-            <w:tcMar>
-              <w:top w:w="70" w:type="dxa"/>
-              <w:left w:w="80" w:type="dxa"/>
-              <w:bottom w:w="70" w:type="dxa"/>
-              <w:right w:w="80" w:type="dxa"/>
-            </w:tcMar>
-            <w:vAlign w:val="center"/>
-          </w:tcPr>
-          <w:p>
-            <w:r>
-              <w:rPr>
-                <w:rFonts w:ascii="Microsoft YaHei" w:hAnsi="Microsoft YaHei" w:eastAsia="Microsoft YaHei"/>
-                <w:b w:val="false"/>
-                <w:sz w:val="16"/>
-              </w:rPr>
-              <w:t xml:space="preserve">______</w:t>
-            </w:r>
-          </w:p>
-        </w:tc>
-        <w:tc>
-          <w:tcPr>
-            <w:tcBorders>
-              <w:top w:val="single" w:color="B7C9D6" w:sz="4"/>
-              <w:left w:val="single" w:color="B7C9D6" w:sz="4"/>
-              <w:bottom w:val="single" w:color="B7C9D6" w:sz="4"/>
-              <w:right w:val="single" w:color="B7C9D6" w:sz="4"/>
-            </w:tcBorders>
-            <w:shd w:val="clear" w:fill="F7FBFF"/>
-            <w:tcMar>
-              <w:top w:w="70" w:type="dxa"/>
-              <w:left w:w="80" w:type="dxa"/>
-              <w:bottom w:w="70" w:type="dxa"/>
-              <w:right w:w="80" w:type="dxa"/>
-            </w:tcMar>
-            <w:vAlign w:val="center"/>
-          </w:tcPr>
-          <w:p>
-            <w:r>
-              <w:rPr>
-                <w:rFonts w:ascii="Microsoft YaHei" w:hAnsi="Microsoft YaHei" w:eastAsia="Microsoft YaHei"/>
-                <w:b w:val="false"/>
-                <w:sz w:val="16"/>
-              </w:rPr>
-              <w:t xml:space="preserve">____________</w:t>
-            </w:r>
-          </w:p>
-        </w:tc>
-        <w:tc>
-          <w:tcPr>
-            <w:tcBorders>
-              <w:top w:val="single" w:color="B7C9D6" w:sz="4"/>
-              <w:left w:val="single" w:color="B7C9D6" w:sz="4"/>
-              <w:bottom w:val="single" w:color="B7C9D6" w:sz="4"/>
-              <w:right w:val="single" w:color="B7C9D6" w:sz="4"/>
-            </w:tcBorders>
-            <w:shd w:val="clear" w:fill="F7FBFF"/>
-            <w:tcMar>
-              <w:top w:w="70" w:type="dxa"/>
-              <w:left w:w="80" w:type="dxa"/>
-              <w:bottom w:w="70" w:type="dxa"/>
-              <w:right w:w="80" w:type="dxa"/>
-            </w:tcMar>
-            <w:vAlign w:val="center"/>
-          </w:tcPr>
-          <w:p>
-            <w:r>
-              <w:rPr>
-                <w:rFonts w:ascii="Microsoft YaHei" w:hAnsi="Microsoft YaHei" w:eastAsia="Microsoft YaHei"/>
-                <w:b w:val="false"/>
-                <w:sz w:val="16"/>
-              </w:rPr>
-              <w:t xml:space="preserve">□合格 □不合格</w:t>
-            </w:r>
-          </w:p>
-        </w:tc>
-        <w:tc>
-          <w:tcPr>
-            <w:tcBorders>
-              <w:top w:val="single" w:color="B7C9D6" w:sz="4"/>
-              <w:left w:val="single" w:color="B7C9D6" w:sz="4"/>
-              <w:bottom w:val="single" w:color="B7C9D6" w:sz="4"/>
-              <w:right w:val="single" w:color="B7C9D6" w:sz="4"/>
-            </w:tcBorders>
-            <w:shd w:val="clear" w:fill="F7FBFF"/>
-            <w:tcMar>
-              <w:top w:w="70" w:type="dxa"/>
-              <w:left w:w="80" w:type="dxa"/>
-              <w:bottom w:w="70" w:type="dxa"/>
-              <w:right w:w="80" w:type="dxa"/>
-            </w:tcMar>
-            <w:vAlign w:val="center"/>
-          </w:tcPr>
-          <w:p>
-            <w:r>
-              <w:rPr>
-                <w:rFonts w:ascii="Microsoft YaHei" w:hAnsi="Microsoft YaHei" w:eastAsia="Microsoft YaHei"/>
-                <w:b w:val="false"/>
-                <w:sz w:val="16"/>
-              </w:rPr>
-              <w:t xml:space="preserve">____________</w:t>
-            </w:r>
-          </w:p>
-        </w:tc>
-        <w:tc>
-          <w:tcPr>
-            <w:tcBorders>
-              <w:top w:val="single" w:color="B7C9D6" w:sz="4"/>
-              <w:left w:val="single" w:color="B7C9D6" w:sz="4"/>
-              <w:bottom w:val="single" w:color="B7C9D6" w:sz="4"/>
-              <w:right w:val="single" w:color="B7C9D6" w:sz="4"/>
-            </w:tcBorders>
-            <w:shd w:val="clear" w:fill="F7FBFF"/>
-            <w:tcMar>
-              <w:top w:w="70" w:type="dxa"/>
-              <w:left w:w="80" w:type="dxa"/>
-              <w:bottom w:w="70" w:type="dxa"/>
-              <w:right w:w="80" w:type="dxa"/>
-            </w:tcMar>
-            <w:vAlign w:val="center"/>
-          </w:tcPr>
-          <w:p>
-            <w:r>
-              <w:rPr>
-                <w:rFonts w:ascii="Microsoft YaHei" w:hAnsi="Microsoft YaHei" w:eastAsia="Microsoft YaHei"/>
-                <w:b w:val="false"/>
-                <w:sz w:val="16"/>
-              </w:rPr>
-              <w:t xml:space="preserve">____________</w:t>
-            </w:r>
-          </w:p>
-        </w:tc>
-        <w:tc>
-          <w:tcPr>
-            <w:tcBorders>
-              <w:top w:val="single" w:color="B7C9D6" w:sz="4"/>
-              <w:left w:val="single" w:color="B7C9D6" w:sz="4"/>
-              <w:bottom w:val="single" w:color="B7C9D6" w:sz="4"/>
-              <w:right w:val="single" w:color="B7C9D6" w:sz="4"/>
-            </w:tcBorders>
-            <w:shd w:val="clear" w:fill="F7FBFF"/>
-            <w:tcMar>
-              <w:top w:w="70" w:type="dxa"/>
-              <w:left w:w="80" w:type="dxa"/>
-              <w:bottom w:w="70" w:type="dxa"/>
-              <w:right w:w="80" w:type="dxa"/>
-            </w:tcMar>
-            <w:vAlign w:val="center"/>
-          </w:tcPr>
-          <w:p>
-            <w:r>
-              <w:rPr>
-                <w:rFonts w:ascii="Microsoft YaHei" w:hAnsi="Microsoft YaHei" w:eastAsia="Microsoft YaHei"/>
-                <w:b w:val="false"/>
-                <w:sz w:val="16"/>
-              </w:rPr>
-              <w:t xml:space="preserve">____________</w:t>
-            </w:r>
-          </w:p>
-        </w:tc>
-      </w:tr>
-      <w:tr>
-        <w:trPr>
-          <w:cantSplit/>
-        </w:trPr>
-        <w:tc>
-          <w:tcPr>
-            <w:tcBorders>
-              <w:top w:val="single" w:color="B7C9D6" w:sz="4"/>
-              <w:left w:val="single" w:color="B7C9D6" w:sz="4"/>
-              <w:bottom w:val="single" w:color="B7C9D6" w:sz="4"/>
-              <w:right w:val="single" w:color="B7C9D6" w:sz="4"/>
-            </w:tcBorders>
-            <w:shd w:val="clear" w:fill="FFFFFF"/>
-            <w:tcMar>
-              <w:top w:w="70" w:type="dxa"/>
-              <w:left w:w="80" w:type="dxa"/>
-              <w:bottom w:w="70" w:type="dxa"/>
-              <w:right w:w="80" w:type="dxa"/>
-            </w:tcMar>
-            <w:vAlign w:val="center"/>
-          </w:tcPr>
-          <w:p>
-            <w:r>
-              <w:rPr>
-                <w:rFonts w:ascii="Microsoft YaHei" w:hAnsi="Microsoft YaHei" w:eastAsia="Microsoft YaHei"/>
-                <w:b w:val="false"/>
-                <w:sz w:val="16"/>
-              </w:rPr>
-              <w:t xml:space="preserve">9</w:t>
-            </w:r>
-          </w:p>
-        </w:tc>
-        <w:tc>
-          <w:tcPr>
-            <w:tcBorders>
-              <w:top w:val="single" w:color="B7C9D6" w:sz="4"/>
-              <w:left w:val="single" w:color="B7C9D6" w:sz="4"/>
-              <w:bottom w:val="single" w:color="B7C9D6" w:sz="4"/>
-              <w:right w:val="single" w:color="B7C9D6" w:sz="4"/>
-            </w:tcBorders>
-            <w:shd w:val="clear" w:fill="FFFFFF"/>
-            <w:tcMar>
-              <w:top w:w="70" w:type="dxa"/>
-              <w:left w:w="80" w:type="dxa"/>
-              <w:bottom w:w="70" w:type="dxa"/>
-              <w:right w:w="80" w:type="dxa"/>
-            </w:tcMar>
-            <w:vAlign w:val="center"/>
-          </w:tcPr>
-          <w:p>
-            <w:r>
-              <w:rPr>
-                <w:rFonts w:ascii="Microsoft YaHei" w:hAnsi="Microsoft YaHei" w:eastAsia="Microsoft YaHei"/>
-                <w:b w:val="false"/>
-                <w:sz w:val="16"/>
-              </w:rPr>
-              <w:t xml:space="preserve">现场填写</w:t>
-            </w:r>
-          </w:p>
-        </w:tc>
-        <w:tc>
-          <w:tcPr>
-            <w:tcBorders>
-              <w:top w:val="single" w:color="B7C9D6" w:sz="4"/>
-              <w:left w:val="single" w:color="B7C9D6" w:sz="4"/>
-              <w:bottom w:val="single" w:color="B7C9D6" w:sz="4"/>
-              <w:right w:val="single" w:color="B7C9D6" w:sz="4"/>
-            </w:tcBorders>
-            <w:shd w:val="clear" w:fill="FFFFFF"/>
-            <w:tcMar>
-              <w:top w:w="70" w:type="dxa"/>
-              <w:left w:w="80" w:type="dxa"/>
-              <w:bottom w:w="70" w:type="dxa"/>
-              <w:right w:w="80" w:type="dxa"/>
-            </w:tcMar>
-            <w:vAlign w:val="center"/>
-          </w:tcPr>
-          <w:p>
-            <w:r>
-              <w:rPr>
-                <w:rFonts w:ascii="Microsoft YaHei" w:hAnsi="Microsoft YaHei" w:eastAsia="Microsoft YaHei"/>
-                <w:b w:val="false"/>
-                <w:sz w:val="16"/>
-              </w:rPr>
-              <w:t xml:space="preserve">现场填写</w:t>
-            </w:r>
-          </w:p>
-        </w:tc>
-        <w:tc>
-          <w:tcPr>
-            <w:tcBorders>
-              <w:top w:val="single" w:color="B7C9D6" w:sz="4"/>
-              <w:left w:val="single" w:color="B7C9D6" w:sz="4"/>
-              <w:bottom w:val="single" w:color="B7C9D6" w:sz="4"/>
-              <w:right w:val="single" w:color="B7C9D6" w:sz="4"/>
-            </w:tcBorders>
-            <w:shd w:val="clear" w:fill="FFFFFF"/>
-            <w:tcMar>
-              <w:top w:w="70" w:type="dxa"/>
-              <w:left w:w="80" w:type="dxa"/>
-              <w:bottom w:w="70" w:type="dxa"/>
-              <w:right w:w="80" w:type="dxa"/>
-            </w:tcMar>
-            <w:vAlign w:val="center"/>
-          </w:tcPr>
-          <w:p>
-            <w:r>
-              <w:rPr>
-                <w:rFonts w:ascii="Microsoft YaHei" w:hAnsi="Microsoft YaHei" w:eastAsia="Microsoft YaHei"/>
-                <w:b w:val="false"/>
-                <w:sz w:val="16"/>
-              </w:rPr>
-              <w:t xml:space="preserve">现场填写</w:t>
-            </w:r>
-          </w:p>
-        </w:tc>
-        <w:tc>
-          <w:tcPr>
-            <w:tcBorders>
-              <w:top w:val="single" w:color="B7C9D6" w:sz="4"/>
-              <w:left w:val="single" w:color="B7C9D6" w:sz="4"/>
-              <w:bottom w:val="single" w:color="B7C9D6" w:sz="4"/>
-              <w:right w:val="single" w:color="B7C9D6" w:sz="4"/>
-            </w:tcBorders>
-            <w:shd w:val="clear" w:fill="FFFFFF"/>
-            <w:tcMar>
-              <w:top w:w="70" w:type="dxa"/>
-              <w:left w:w="80" w:type="dxa"/>
-              <w:bottom w:w="70" w:type="dxa"/>
-              <w:right w:w="80" w:type="dxa"/>
-            </w:tcMar>
-            <w:vAlign w:val="center"/>
-          </w:tcPr>
-          <w:p>
-            <w:r>
-              <w:rPr>
-                <w:rFonts w:ascii="Microsoft YaHei" w:hAnsi="Microsoft YaHei" w:eastAsia="Microsoft YaHei"/>
-                <w:b w:val="false"/>
-                <w:sz w:val="16"/>
-              </w:rPr>
-              <w:t xml:space="preserve">现场填写</w:t>
-            </w:r>
-          </w:p>
-        </w:tc>
-        <w:tc>
-          <w:tcPr>
-            <w:tcBorders>
-              <w:top w:val="single" w:color="B7C9D6" w:sz="4"/>
-              <w:left w:val="single" w:color="B7C9D6" w:sz="4"/>
-              <w:bottom w:val="single" w:color="B7C9D6" w:sz="4"/>
-              <w:right w:val="single" w:color="B7C9D6" w:sz="4"/>
-            </w:tcBorders>
-            <w:shd w:val="clear" w:fill="FFFFFF"/>
-            <w:tcMar>
-              <w:top w:w="70" w:type="dxa"/>
-              <w:left w:w="80" w:type="dxa"/>
-              <w:bottom w:w="70" w:type="dxa"/>
-              <w:right w:w="80" w:type="dxa"/>
-            </w:tcMar>
-            <w:vAlign w:val="center"/>
-          </w:tcPr>
-          <w:p>
-            <w:r>
-              <w:rPr>
-                <w:rFonts w:ascii="Microsoft YaHei" w:hAnsi="Microsoft YaHei" w:eastAsia="Microsoft YaHei"/>
-                <w:b w:val="false"/>
-                <w:sz w:val="16"/>
-              </w:rPr>
-              <w:t xml:space="preserve">____________</w:t>
-            </w:r>
-          </w:p>
-        </w:tc>
-        <w:tc>
-          <w:tcPr>
-            <w:tcBorders>
-              <w:top w:val="single" w:color="B7C9D6" w:sz="4"/>
-              <w:left w:val="single" w:color="B7C9D6" w:sz="4"/>
-              <w:bottom w:val="single" w:color="B7C9D6" w:sz="4"/>
-              <w:right w:val="single" w:color="B7C9D6" w:sz="4"/>
-            </w:tcBorders>
-            <w:shd w:val="clear" w:fill="FFFFFF"/>
-            <w:tcMar>
-              <w:top w:w="70" w:type="dxa"/>
-              <w:left w:w="80" w:type="dxa"/>
-              <w:bottom w:w="70" w:type="dxa"/>
-              <w:right w:w="80" w:type="dxa"/>
-            </w:tcMar>
-            <w:vAlign w:val="center"/>
-          </w:tcPr>
-          <w:p>
-            <w:r>
-              <w:rPr>
-                <w:rFonts w:ascii="Microsoft YaHei" w:hAnsi="Microsoft YaHei" w:eastAsia="Microsoft YaHei"/>
-                <w:b w:val="false"/>
-                <w:sz w:val="16"/>
-              </w:rPr>
-              <w:t xml:space="preserve">______</w:t>
-            </w:r>
-          </w:p>
-        </w:tc>
-        <w:tc>
-          <w:tcPr>
-            <w:tcBorders>
-              <w:top w:val="single" w:color="B7C9D6" w:sz="4"/>
-              <w:left w:val="single" w:color="B7C9D6" w:sz="4"/>
-              <w:bottom w:val="single" w:color="B7C9D6" w:sz="4"/>
-              <w:right w:val="single" w:color="B7C9D6" w:sz="4"/>
-            </w:tcBorders>
-            <w:shd w:val="clear" w:fill="FFFFFF"/>
-            <w:tcMar>
-              <w:top w:w="70" w:type="dxa"/>
-              <w:left w:w="80" w:type="dxa"/>
-              <w:bottom w:w="70" w:type="dxa"/>
-              <w:right w:w="80" w:type="dxa"/>
-            </w:tcMar>
-            <w:vAlign w:val="center"/>
-          </w:tcPr>
-          <w:p>
-            <w:r>
-              <w:rPr>
-                <w:rFonts w:ascii="Microsoft YaHei" w:hAnsi="Microsoft YaHei" w:eastAsia="Microsoft YaHei"/>
-                <w:b w:val="false"/>
-                <w:sz w:val="16"/>
-              </w:rPr>
-              <w:t xml:space="preserve">____________</w:t>
-            </w:r>
-          </w:p>
-        </w:tc>
-        <w:tc>
-          <w:tcPr>
-            <w:tcBorders>
-              <w:top w:val="single" w:color="B7C9D6" w:sz="4"/>
-              <w:left w:val="single" w:color="B7C9D6" w:sz="4"/>
-              <w:bottom w:val="single" w:color="B7C9D6" w:sz="4"/>
-              <w:right w:val="single" w:color="B7C9D6" w:sz="4"/>
-            </w:tcBorders>
-            <w:shd w:val="clear" w:fill="FFFFFF"/>
-            <w:tcMar>
-              <w:top w:w="70" w:type="dxa"/>
-              <w:left w:w="80" w:type="dxa"/>
-              <w:bottom w:w="70" w:type="dxa"/>
-              <w:right w:w="80" w:type="dxa"/>
-            </w:tcMar>
-            <w:vAlign w:val="center"/>
-          </w:tcPr>
-          <w:p>
-            <w:r>
-              <w:rPr>
-                <w:rFonts w:ascii="Microsoft YaHei" w:hAnsi="Microsoft YaHei" w:eastAsia="Microsoft YaHei"/>
-                <w:b w:val="false"/>
-                <w:sz w:val="16"/>
-              </w:rPr>
-              <w:t xml:space="preserve">□合格 □不合格</w:t>
-            </w:r>
-          </w:p>
-        </w:tc>
-        <w:tc>
-          <w:tcPr>
-            <w:tcBorders>
-              <w:top w:val="single" w:color="B7C9D6" w:sz="4"/>
-              <w:left w:val="single" w:color="B7C9D6" w:sz="4"/>
-              <w:bottom w:val="single" w:color="B7C9D6" w:sz="4"/>
-              <w:right w:val="single" w:color="B7C9D6" w:sz="4"/>
-            </w:tcBorders>
-            <w:shd w:val="clear" w:fill="FFFFFF"/>
-            <w:tcMar>
-              <w:top w:w="70" w:type="dxa"/>
-              <w:left w:w="80" w:type="dxa"/>
-              <w:bottom w:w="70" w:type="dxa"/>
-              <w:right w:w="80" w:type="dxa"/>
-            </w:tcMar>
-            <w:vAlign w:val="center"/>
-          </w:tcPr>
-          <w:p>
-            <w:r>
-              <w:rPr>
-                <w:rFonts w:ascii="Microsoft YaHei" w:hAnsi="Microsoft YaHei" w:eastAsia="Microsoft YaHei"/>
-                <w:b w:val="false"/>
-                <w:sz w:val="16"/>
-              </w:rPr>
-              <w:t xml:space="preserve">____________</w:t>
-            </w:r>
-          </w:p>
-        </w:tc>
-        <w:tc>
-          <w:tcPr>
-            <w:tcBorders>
-              <w:top w:val="single" w:color="B7C9D6" w:sz="4"/>
-              <w:left w:val="single" w:color="B7C9D6" w:sz="4"/>
-              <w:bottom w:val="single" w:color="B7C9D6" w:sz="4"/>
-              <w:right w:val="single" w:color="B7C9D6" w:sz="4"/>
-            </w:tcBorders>
-            <w:shd w:val="clear" w:fill="FFFFFF"/>
-            <w:tcMar>
-              <w:top w:w="70" w:type="dxa"/>
-              <w:left w:w="80" w:type="dxa"/>
-              <w:bottom w:w="70" w:type="dxa"/>
-              <w:right w:w="80" w:type="dxa"/>
-            </w:tcMar>
-            <w:vAlign w:val="center"/>
-          </w:tcPr>
-          <w:p>
-            <w:r>
-              <w:rPr>
-                <w:rFonts w:ascii="Microsoft YaHei" w:hAnsi="Microsoft YaHei" w:eastAsia="Microsoft YaHei"/>
-                <w:b w:val="false"/>
-                <w:sz w:val="16"/>
-              </w:rPr>
-              <w:t xml:space="preserve">____________</w:t>
-            </w:r>
-          </w:p>
-        </w:tc>
-        <w:tc>
-          <w:tcPr>
-            <w:tcBorders>
-              <w:top w:val="single" w:color="B7C9D6" w:sz="4"/>
-              <w:left w:val="single" w:color="B7C9D6" w:sz="4"/>
-              <w:bottom w:val="single" w:color="B7C9D6" w:sz="4"/>
-              <w:right w:val="single" w:color="B7C9D6" w:sz="4"/>
-            </w:tcBorders>
-            <w:shd w:val="clear" w:fill="FFFFFF"/>
-            <w:tcMar>
-              <w:top w:w="70" w:type="dxa"/>
-              <w:left w:w="80" w:type="dxa"/>
-              <w:bottom w:w="70" w:type="dxa"/>
-              <w:right w:w="80" w:type="dxa"/>
-            </w:tcMar>
-            <w:vAlign w:val="center"/>
-          </w:tcPr>
-          <w:p>
-            <w:r>
-              <w:rPr>
-                <w:rFonts w:ascii="Microsoft YaHei" w:hAnsi="Microsoft YaHei" w:eastAsia="Microsoft YaHei"/>
-                <w:b w:val="false"/>
-                <w:sz w:val="16"/>
-              </w:rPr>
-              <w:t xml:space="preserve">____________</w:t>
-            </w:r>
-          </w:p>
-        </w:tc>
-      </w:tr>
-      <w:tr>
-        <w:trPr>
-          <w:cantSplit/>
-        </w:trPr>
-        <w:tc>
-          <w:tcPr>
-            <w:tcBorders>
-              <w:top w:val="single" w:color="B7C9D6" w:sz="4"/>
-              <w:left w:val="single" w:color="B7C9D6" w:sz="4"/>
-              <w:bottom w:val="single" w:color="B7C9D6" w:sz="4"/>
-              <w:right w:val="single" w:color="B7C9D6" w:sz="4"/>
-            </w:tcBorders>
-            <w:shd w:val="clear" w:fill="F7FBFF"/>
-            <w:tcMar>
-              <w:top w:w="70" w:type="dxa"/>
-              <w:left w:w="80" w:type="dxa"/>
-              <w:bottom w:w="70" w:type="dxa"/>
-              <w:right w:w="80" w:type="dxa"/>
-            </w:tcMar>
-            <w:vAlign w:val="center"/>
-          </w:tcPr>
-          <w:p>
-            <w:r>
-              <w:rPr>
-                <w:rFonts w:ascii="Microsoft YaHei" w:hAnsi="Microsoft YaHei" w:eastAsia="Microsoft YaHei"/>
-                <w:b w:val="false"/>
-                <w:sz w:val="16"/>
-              </w:rPr>
-              <w:t xml:space="preserve">10</w:t>
-            </w:r>
-          </w:p>
-        </w:tc>
-        <w:tc>
-          <w:tcPr>
-            <w:tcBorders>
-              <w:top w:val="single" w:color="B7C9D6" w:sz="4"/>
-              <w:left w:val="single" w:color="B7C9D6" w:sz="4"/>
-              <w:bottom w:val="single" w:color="B7C9D6" w:sz="4"/>
-              <w:right w:val="single" w:color="B7C9D6" w:sz="4"/>
-            </w:tcBorders>
-            <w:shd w:val="clear" w:fill="F7FBFF"/>
-            <w:tcMar>
-              <w:top w:w="70" w:type="dxa"/>
-              <w:left w:w="80" w:type="dxa"/>
-              <w:bottom w:w="70" w:type="dxa"/>
-              <w:right w:w="80" w:type="dxa"/>
-            </w:tcMar>
-            <w:vAlign w:val="center"/>
-          </w:tcPr>
-          <w:p>
-            <w:r>
-              <w:rPr>
-                <w:rFonts w:ascii="Microsoft YaHei" w:hAnsi="Microsoft YaHei" w:eastAsia="Microsoft YaHei"/>
-                <w:b w:val="false"/>
-                <w:sz w:val="16"/>
-              </w:rPr>
-              <w:t xml:space="preserve">现场填写</w:t>
-            </w:r>
-          </w:p>
-        </w:tc>
-        <w:tc>
-          <w:tcPr>
-            <w:tcBorders>
-              <w:top w:val="single" w:color="B7C9D6" w:sz="4"/>
-              <w:left w:val="single" w:color="B7C9D6" w:sz="4"/>
-              <w:bottom w:val="single" w:color="B7C9D6" w:sz="4"/>
-              <w:right w:val="single" w:color="B7C9D6" w:sz="4"/>
-            </w:tcBorders>
-            <w:shd w:val="clear" w:fill="F7FBFF"/>
-            <w:tcMar>
-              <w:top w:w="70" w:type="dxa"/>
-              <w:left w:w="80" w:type="dxa"/>
-              <w:bottom w:w="70" w:type="dxa"/>
-              <w:right w:w="80" w:type="dxa"/>
-            </w:tcMar>
-            <w:vAlign w:val="center"/>
-          </w:tcPr>
-          <w:p>
-            <w:r>
-              <w:rPr>
-                <w:rFonts w:ascii="Microsoft YaHei" w:hAnsi="Microsoft YaHei" w:eastAsia="Microsoft YaHei"/>
-                <w:b w:val="false"/>
-                <w:sz w:val="16"/>
-              </w:rPr>
-              <w:t xml:space="preserve">现场填写</w:t>
-            </w:r>
-          </w:p>
-        </w:tc>
-        <w:tc>
-          <w:tcPr>
-            <w:tcBorders>
-              <w:top w:val="single" w:color="B7C9D6" w:sz="4"/>
-              <w:left w:val="single" w:color="B7C9D6" w:sz="4"/>
-              <w:bottom w:val="single" w:color="B7C9D6" w:sz="4"/>
-              <w:right w:val="single" w:color="B7C9D6" w:sz="4"/>
-            </w:tcBorders>
-            <w:shd w:val="clear" w:fill="F7FBFF"/>
-            <w:tcMar>
-              <w:top w:w="70" w:type="dxa"/>
-              <w:left w:w="80" w:type="dxa"/>
-              <w:bottom w:w="70" w:type="dxa"/>
-              <w:right w:w="80" w:type="dxa"/>
-            </w:tcMar>
-            <w:vAlign w:val="center"/>
-          </w:tcPr>
-          <w:p>
-            <w:r>
-              <w:rPr>
-                <w:rFonts w:ascii="Microsoft YaHei" w:hAnsi="Microsoft YaHei" w:eastAsia="Microsoft YaHei"/>
-                <w:b w:val="false"/>
-                <w:sz w:val="16"/>
-              </w:rPr>
-              <w:t xml:space="preserve">现场填写</w:t>
-            </w:r>
-          </w:p>
-        </w:tc>
-        <w:tc>
-          <w:tcPr>
-            <w:tcBorders>
-              <w:top w:val="single" w:color="B7C9D6" w:sz="4"/>
-              <w:left w:val="single" w:color="B7C9D6" w:sz="4"/>
-              <w:bottom w:val="single" w:color="B7C9D6" w:sz="4"/>
-              <w:right w:val="single" w:color="B7C9D6" w:sz="4"/>
-            </w:tcBorders>
-            <w:shd w:val="clear" w:fill="F7FBFF"/>
-            <w:tcMar>
-              <w:top w:w="70" w:type="dxa"/>
-              <w:left w:w="80" w:type="dxa"/>
-              <w:bottom w:w="70" w:type="dxa"/>
-              <w:right w:w="80" w:type="dxa"/>
-            </w:tcMar>
-            <w:vAlign w:val="center"/>
-          </w:tcPr>
-          <w:p>
-            <w:r>
-              <w:rPr>
-                <w:rFonts w:ascii="Microsoft YaHei" w:hAnsi="Microsoft YaHei" w:eastAsia="Microsoft YaHei"/>
-                <w:b w:val="false"/>
-                <w:sz w:val="16"/>
-              </w:rPr>
-              <w:t xml:space="preserve">现场填写</w:t>
-            </w:r>
-          </w:p>
-        </w:tc>
-        <w:tc>
-          <w:tcPr>
-            <w:tcBorders>
-              <w:top w:val="single" w:color="B7C9D6" w:sz="4"/>
-              <w:left w:val="single" w:color="B7C9D6" w:sz="4"/>
-              <w:bottom w:val="single" w:color="B7C9D6" w:sz="4"/>
-              <w:right w:val="single" w:color="B7C9D6" w:sz="4"/>
-            </w:tcBorders>
-            <w:shd w:val="clear" w:fill="F7FBFF"/>
-            <w:tcMar>
-              <w:top w:w="70" w:type="dxa"/>
-              <w:left w:w="80" w:type="dxa"/>
-              <w:bottom w:w="70" w:type="dxa"/>
-              <w:right w:w="80" w:type="dxa"/>
-            </w:tcMar>
-            <w:vAlign w:val="center"/>
-          </w:tcPr>
-          <w:p>
-            <w:r>
-              <w:rPr>
-                <w:rFonts w:ascii="Microsoft YaHei" w:hAnsi="Microsoft YaHei" w:eastAsia="Microsoft YaHei"/>
-                <w:b w:val="false"/>
-                <w:sz w:val="16"/>
-              </w:rPr>
-              <w:t xml:space="preserve">____________</w:t>
-            </w:r>
-          </w:p>
-        </w:tc>
-        <w:tc>
-          <w:tcPr>
-            <w:tcBorders>
-              <w:top w:val="single" w:color="B7C9D6" w:sz="4"/>
-              <w:left w:val="single" w:color="B7C9D6" w:sz="4"/>
-              <w:bottom w:val="single" w:color="B7C9D6" w:sz="4"/>
-              <w:right w:val="single" w:color="B7C9D6" w:sz="4"/>
-            </w:tcBorders>
-            <w:shd w:val="clear" w:fill="F7FBFF"/>
-            <w:tcMar>
-              <w:top w:w="70" w:type="dxa"/>
-              <w:left w:w="80" w:type="dxa"/>
-              <w:bottom w:w="70" w:type="dxa"/>
-              <w:right w:w="80" w:type="dxa"/>
-            </w:tcMar>
-            <w:vAlign w:val="center"/>
-          </w:tcPr>
-          <w:p>
-            <w:r>
-              <w:rPr>
-                <w:rFonts w:ascii="Microsoft YaHei" w:hAnsi="Microsoft YaHei" w:eastAsia="Microsoft YaHei"/>
-                <w:b w:val="false"/>
-                <w:sz w:val="16"/>
-              </w:rPr>
-              <w:t xml:space="preserve">______</w:t>
-            </w:r>
-          </w:p>
-        </w:tc>
-        <w:tc>
-          <w:tcPr>
-            <w:tcBorders>
-              <w:top w:val="single" w:color="B7C9D6" w:sz="4"/>
-              <w:left w:val="single" w:color="B7C9D6" w:sz="4"/>
-              <w:bottom w:val="single" w:color="B7C9D6" w:sz="4"/>
-              <w:right w:val="single" w:color="B7C9D6" w:sz="4"/>
-            </w:tcBorders>
-            <w:shd w:val="clear" w:fill="F7FBFF"/>
-            <w:tcMar>
-              <w:top w:w="70" w:type="dxa"/>
-              <w:left w:w="80" w:type="dxa"/>
-              <w:bottom w:w="70" w:type="dxa"/>
-              <w:right w:w="80" w:type="dxa"/>
-            </w:tcMar>
-            <w:vAlign w:val="center"/>
-          </w:tcPr>
-          <w:p>
-            <w:r>
-              <w:rPr>
-                <w:rFonts w:ascii="Microsoft YaHei" w:hAnsi="Microsoft YaHei" w:eastAsia="Microsoft YaHei"/>
-                <w:b w:val="false"/>
-                <w:sz w:val="16"/>
-              </w:rPr>
-              <w:t xml:space="preserve">____________</w:t>
-            </w:r>
-          </w:p>
-        </w:tc>
-        <w:tc>
-          <w:tcPr>
-            <w:tcBorders>
-              <w:top w:val="single" w:color="B7C9D6" w:sz="4"/>
-              <w:left w:val="single" w:color="B7C9D6" w:sz="4"/>
-              <w:bottom w:val="single" w:color="B7C9D6" w:sz="4"/>
-              <w:right w:val="single" w:color="B7C9D6" w:sz="4"/>
-            </w:tcBorders>
-            <w:shd w:val="clear" w:fill="F7FBFF"/>
-            <w:tcMar>
-              <w:top w:w="70" w:type="dxa"/>
-              <w:left w:w="80" w:type="dxa"/>
-              <w:bottom w:w="70" w:type="dxa"/>
-              <w:right w:w="80" w:type="dxa"/>
-            </w:tcMar>
-            <w:vAlign w:val="center"/>
-          </w:tcPr>
-          <w:p>
-            <w:r>
-              <w:rPr>
-                <w:rFonts w:ascii="Microsoft YaHei" w:hAnsi="Microsoft YaHei" w:eastAsia="Microsoft YaHei"/>
-                <w:b w:val="false"/>
-                <w:sz w:val="16"/>
-              </w:rPr>
-              <w:t xml:space="preserve">□合格 □不合格</w:t>
-            </w:r>
-          </w:p>
-        </w:tc>
-        <w:tc>
-          <w:tcPr>
-            <w:tcBorders>
-              <w:top w:val="single" w:color="B7C9D6" w:sz="4"/>
-              <w:left w:val="single" w:color="B7C9D6" w:sz="4"/>
-              <w:bottom w:val="single" w:color="B7C9D6" w:sz="4"/>
-              <w:right w:val="single" w:color="B7C9D6" w:sz="4"/>
-            </w:tcBorders>
-            <w:shd w:val="clear" w:fill="F7FBFF"/>
-            <w:tcMar>
-              <w:top w:w="70" w:type="dxa"/>
-              <w:left w:w="80" w:type="dxa"/>
-              <w:bottom w:w="70" w:type="dxa"/>
-              <w:right w:w="80" w:type="dxa"/>
-            </w:tcMar>
-            <w:vAlign w:val="center"/>
-          </w:tcPr>
-          <w:p>
-            <w:r>
-              <w:rPr>
-                <w:rFonts w:ascii="Microsoft YaHei" w:hAnsi="Microsoft YaHei" w:eastAsia="Microsoft YaHei"/>
-                <w:b w:val="false"/>
-                <w:sz w:val="16"/>
-              </w:rPr>
-              <w:t xml:space="preserve">____________</w:t>
-            </w:r>
-          </w:p>
-        </w:tc>
-        <w:tc>
-          <w:tcPr>
-            <w:tcBorders>
-              <w:top w:val="single" w:color="B7C9D6" w:sz="4"/>
-              <w:left w:val="single" w:color="B7C9D6" w:sz="4"/>
-              <w:bottom w:val="single" w:color="B7C9D6" w:sz="4"/>
-              <w:right w:val="single" w:color="B7C9D6" w:sz="4"/>
-            </w:tcBorders>
-            <w:shd w:val="clear" w:fill="F7FBFF"/>
-            <w:tcMar>
-              <w:top w:w="70" w:type="dxa"/>
-              <w:left w:w="80" w:type="dxa"/>
-              <w:bottom w:w="70" w:type="dxa"/>
-              <w:right w:w="80" w:type="dxa"/>
-            </w:tcMar>
-            <w:vAlign w:val="center"/>
-          </w:tcPr>
-          <w:p>
-            <w:r>
-              <w:rPr>
-                <w:rFonts w:ascii="Microsoft YaHei" w:hAnsi="Microsoft YaHei" w:eastAsia="Microsoft YaHei"/>
-                <w:b w:val="false"/>
-                <w:sz w:val="16"/>
-              </w:rPr>
-              <w:t xml:space="preserve">____________</w:t>
-            </w:r>
-          </w:p>
-        </w:tc>
-        <w:tc>
-          <w:tcPr>
-            <w:tcBorders>
-              <w:top w:val="single" w:color="B7C9D6" w:sz="4"/>
-              <w:left w:val="single" w:color="B7C9D6" w:sz="4"/>
-              <w:bottom w:val="single" w:color="B7C9D6" w:sz="4"/>
-              <w:right w:val="single" w:color="B7C9D6" w:sz="4"/>
-            </w:tcBorders>
-            <w:shd w:val="clear" w:fill="F7FBFF"/>
-            <w:tcMar>
-              <w:top w:w="70" w:type="dxa"/>
-              <w:left w:w="80" w:type="dxa"/>
-              <w:bottom w:w="70" w:type="dxa"/>
-              <w:right w:w="80" w:type="dxa"/>
-            </w:tcMar>
-            <w:vAlign w:val="center"/>
-          </w:tcPr>
-          <w:p>
-            <w:r>
-              <w:rPr>
-                <w:rFonts w:ascii="Microsoft YaHei" w:hAnsi="Microsoft YaHei" w:eastAsia="Microsoft YaHei"/>
-                <w:b w:val="false"/>
-                <w:sz w:val="16"/>
-              </w:rPr>
-              <w:t xml:space="preserve">____________</w:t>
-            </w:r>
-          </w:p>
-        </w:tc>
-      </w:tr>
     </w:tbl>
+    <w:p>
+      <w:pPr>
+        <w:pStyle w:val="Normal"/>
+        <w:wordWrap xmlns:w="http://schemas.openxmlformats.org/wordprocessingml/2006/main" w:val="1"/>
+        <w:spacing w:before="60" w:after="80" w:line="276" w:lineRule="auto"/>
+        <w:ind w:firstLine="360"/>
+        <w:jc w:val="left"/>
+      </w:pPr>
+      <w:r>
+        <w:rPr>
+          <w:rFonts w:ascii="Microsoft YaHei" w:hAnsi="Microsoft YaHei" w:eastAsia="Microsoft YaHei"/>
+          <w:b w:val="false"/>
+          <w:i/>
+          <w:color w:val="666666"/>
+          <w:sz w:val="17"/>
+        </w:rPr>
+        <w:t xml:space="preserve">注：受训人员超过本页容量时复制本页，保持一人一行并连续使用同一课程记录编号。</w:t>
+      </w:r>
+    </w:p>
     <w:p>
       <w:pPr>
         <w:pStyle w:val="Normal"/>
@@ -14717,8 +13372,8 @@
       </w:r>
     </w:p>
     <w:sectPr>
-      <w:footerReference w:type="default" r:id="Raf95911cc6fc4b7e"/>
-      <w:footerReference w:type="first" r:id="Rb0bb1c1de0db4fd5"/>
+      <w:footerReference w:type="default" r:id="R544aa74b8fb34948"/>
+      <w:footerReference w:type="first" r:id="Rff67d5a5951d4e36"/>
       <w:pgSz w:w="11906" w:h="16838"/>
       <w:pgMar w:top="1134" w:right="1247" w:bottom="1134" w:left="1247" w:footer="680"/>
       <w:titlePg/>

</xml_diff>